<commit_message>
Update Brazil manual deposit PRD to V1.36
</commit_message>
<xml_diff>
--- a/brazil/manual-deposit/prd.docx
+++ b/brazil/manual-deposit/prd.docx
@@ -164,7 +164,7 @@
                 <w:b w:val="0"/>
                 <w:sz w:val="16"/>
               </w:rPr>
-              <w:t>V1.35</w:t>
+              <w:t>V1.36</w:t>
             </w:r>
           </w:p>
         </w:tc>
@@ -11329,7 +11329,7 @@
                 <w:b w:val="0"/>
                 <w:sz w:val="16"/>
               </w:rPr>
-              <w:t>同单第 0 笔，计存款</w:t>
+              <w:t>同单第一笔，先触发存款记录，计存款</w:t>
             </w:r>
           </w:p>
         </w:tc>
@@ -11478,7 +11478,7 @@
                 <w:b w:val="0"/>
                 <w:sz w:val="16"/>
               </w:rPr>
-              <w:t>同单第 0 笔，计优惠</w:t>
+              <w:t>同单第二笔，计优惠</w:t>
             </w:r>
           </w:p>
         </w:tc>

</xml_diff>

<commit_message>
update multiplier template rules
</commit_message>
<xml_diff>
--- a/brazil/manual-deposit/prd.docx
+++ b/brazil/manual-deposit/prd.docx
@@ -6208,7 +6208,7 @@
                 <w:color w:val="1F2937"/>
                 <w:sz w:val="17"/>
               </w:rPr>
-              <w:t>列包含创建时间、模板名称、加倍类型、操作人、操作；支持新增、编辑、删除。</w:t>
+              <w:t>列包含创建时间、模板名称、加倍类型、操作人、操作；支持新增、编辑、删除。默认模板由系统开站时自动创建，不可修改、删除；默认档位为 10.00/2.00、20.00/5.00、30.00/6.00、40.00/7.00、80.00/8.00、100.00/10.00。</w:t>
             </w:r>
           </w:p>
         </w:tc>
@@ -6379,7 +6379,64 @@
                 <w:color w:val="1F2937"/>
                 <w:sz w:val="17"/>
               </w:rPr>
-              <w:t>删除模板弹窗提示：确认删除该模板？使用中的模板被删除系统会自动切换至默认模板。</w:t>
+              <w:t>非默认模板可删除；点击删除后仅弹窗提示“确认删除该模板？”，不再展示红色补充说明。默认模板不展示编辑、删除按钮。</w:t>
+            </w:r>
+          </w:p>
+        </w:tc>
+      </w:tr>
+      <w:tr>
+        <w:tc>
+          <w:tcPr>
+            <w:tcW w:type="dxa" w:w="5227"/>
+            <w:vAlign w:val="center"/>
+            <w:tcMar>
+              <w:top w:w="115" w:type="dxa"/>
+              <w:start w:w="115" w:type="dxa"/>
+              <w:bottom w:w="115" w:type="dxa"/>
+              <w:end w:w="115" w:type="dxa"/>
+            </w:tcMar>
+            <w:shd w:fill="FBFDFF"/>
+          </w:tcPr>
+          <w:p>
+            <w:pPr>
+              <w:spacing w:after="0" w:line="288" w:lineRule="auto"/>
+            </w:pPr>
+            <w:r/>
+            <w:r>
+              <w:rPr>
+                <w:rFonts w:ascii="Arial" w:hAnsi="Arial" w:eastAsia="STHeiti" w:cs="Arial"/>
+                <w:b w:val="0"/>
+                <w:color w:val="0F4F91"/>
+                <w:sz w:val="17"/>
+              </w:rPr>
+              <w:t>模板快照</w:t>
+            </w:r>
+          </w:p>
+        </w:tc>
+        <w:tc>
+          <w:tcPr>
+            <w:tcW w:type="dxa" w:w="5227"/>
+            <w:vAlign w:val="center"/>
+            <w:tcMar>
+              <w:top w:w="115" w:type="dxa"/>
+              <w:start w:w="115" w:type="dxa"/>
+              <w:bottom w:w="115" w:type="dxa"/>
+              <w:end w:w="115" w:type="dxa"/>
+            </w:tcMar>
+          </w:tcPr>
+          <w:p>
+            <w:pPr>
+              <w:spacing w:after="0" w:line="288" w:lineRule="auto"/>
+            </w:pPr>
+            <w:r/>
+            <w:r>
+              <w:rPr>
+                <w:rFonts w:ascii="Arial" w:hAnsi="Arial" w:eastAsia="STHeiti" w:cs="Arial"/>
+                <w:b w:val="0"/>
+                <w:color w:val="1F2937"/>
+                <w:sz w:val="17"/>
+              </w:rPr>
+              <w:t>人工优惠选择模板创建时，读取并保存当前所选模板快照；后续模板修改、删除或默认模板切换均不影响已创建优惠记录的配置、领取计算和详情展示。</w:t>
             </w:r>
           </w:p>
         </w:tc>
@@ -22140,7 +22197,7 @@
           <w:color w:val="2F3B4C"/>
           <w:sz w:val="19"/>
         </w:rPr>
-        <w:t>奖励加倍模板删除后切换默认模板的影响范围需后端确认是否影响历史记录。</w:t>
+        <w:t>奖励加倍模板删除后的历史订单按已保存模板快照展示和计算，不受模板后续修改、删除或默认模板切换影响。</w:t>
       </w:r>
     </w:p>
     <w:p>

</xml_diff>

<commit_message>
clarify batch discount order lifecycle
</commit_message>
<xml_diff>
--- a/brazil/manual-deposit/prd.docx
+++ b/brazil/manual-deposit/prd.docx
@@ -7207,7 +7207,121 @@
                 <w:color w:val="1F2937"/>
                 <w:sz w:val="17"/>
               </w:rPr>
-              <w:t>准备、暂停等未完成记录支持作废，二次确认后状态变为作废。运行中记录需先暂停后再作废，避免执行中任务被直接终止。原型可演示导入中、导入失败、准备、运行中、暂停、已完成、作废状态；真实状态是否前端同步展示以后端回传为准。</w:t>
+              <w:t>主单状态为待执行、执行中、已暂停、已完成时均支持点击作废；点击后弹出二次确认，确认后主单状态更新为作废。作废后不再继续处理未执行数据。</w:t>
+            </w:r>
+          </w:p>
+        </w:tc>
+      </w:tr>
+      <w:tr>
+        <w:tc>
+          <w:tcPr>
+            <w:tcW w:type="dxa" w:w="5227"/>
+            <w:vAlign w:val="center"/>
+            <w:tcMar>
+              <w:top w:w="115" w:type="dxa"/>
+              <w:start w:w="115" w:type="dxa"/>
+              <w:bottom w:w="115" w:type="dxa"/>
+              <w:end w:w="115" w:type="dxa"/>
+            </w:tcMar>
+            <w:shd w:fill="FBFDFF"/>
+          </w:tcPr>
+          <w:p>
+            <w:pPr>
+              <w:spacing w:after="0" w:line="288" w:lineRule="auto"/>
+            </w:pPr>
+            <w:r/>
+            <w:r>
+              <w:rPr>
+                <w:rFonts w:ascii="Arial" w:hAnsi="Arial" w:eastAsia="STHeiti" w:cs="Arial"/>
+                <w:b w:val="0"/>
+                <w:color w:val="0F4F91"/>
+                <w:sz w:val="17"/>
+              </w:rPr>
+              <w:t>子单作废规则</w:t>
+            </w:r>
+          </w:p>
+        </w:tc>
+        <w:tc>
+          <w:tcPr>
+            <w:tcW w:type="dxa" w:w="5227"/>
+            <w:vAlign w:val="center"/>
+            <w:tcMar>
+              <w:top w:w="115" w:type="dxa"/>
+              <w:start w:w="115" w:type="dxa"/>
+              <w:bottom w:w="115" w:type="dxa"/>
+              <w:end w:w="115" w:type="dxa"/>
+            </w:tcMar>
+          </w:tcPr>
+          <w:p>
+            <w:pPr>
+              <w:spacing w:after="0" w:line="288" w:lineRule="auto"/>
+            </w:pPr>
+            <w:r/>
+            <w:r>
+              <w:rPr>
+                <w:rFonts w:ascii="Arial" w:hAnsi="Arial" w:eastAsia="STHeiti" w:cs="Arial"/>
+                <w:b w:val="0"/>
+                <w:color w:val="1F2937"/>
+                <w:sz w:val="17"/>
+              </w:rPr>
+              <w:t>主单作废时，子单领取状态为未领取的注单统一转为作废，不再在客户端展示或允许领取；子单状态为已领取、过期、放弃的注单不受主单作废影响，保留原状态和记录。</w:t>
+            </w:r>
+          </w:p>
+        </w:tc>
+      </w:tr>
+      <w:tr>
+        <w:tc>
+          <w:tcPr>
+            <w:tcW w:type="dxa" w:w="5227"/>
+            <w:vAlign w:val="center"/>
+            <w:tcMar>
+              <w:top w:w="115" w:type="dxa"/>
+              <w:start w:w="115" w:type="dxa"/>
+              <w:bottom w:w="115" w:type="dxa"/>
+              <w:end w:w="115" w:type="dxa"/>
+            </w:tcMar>
+            <w:shd w:fill="FBFDFF"/>
+          </w:tcPr>
+          <w:p>
+            <w:pPr>
+              <w:spacing w:after="0" w:line="288" w:lineRule="auto"/>
+            </w:pPr>
+            <w:r/>
+            <w:r>
+              <w:rPr>
+                <w:rFonts w:ascii="Arial" w:hAnsi="Arial" w:eastAsia="STHeiti" w:cs="Arial"/>
+                <w:b w:val="0"/>
+                <w:color w:val="0F4F91"/>
+                <w:sz w:val="17"/>
+              </w:rPr>
+              <w:t>子单预读与执行进度</w:t>
+            </w:r>
+          </w:p>
+        </w:tc>
+        <w:tc>
+          <w:tcPr>
+            <w:tcW w:type="dxa" w:w="5227"/>
+            <w:vAlign w:val="center"/>
+            <w:tcMar>
+              <w:top w:w="115" w:type="dxa"/>
+              <w:start w:w="115" w:type="dxa"/>
+              <w:bottom w:w="115" w:type="dxa"/>
+              <w:end w:w="115" w:type="dxa"/>
+            </w:tcMar>
+          </w:tcPr>
+          <w:p>
+            <w:pPr>
+              <w:spacing w:after="0" w:line="288" w:lineRule="auto"/>
+            </w:pPr>
+            <w:r/>
+            <w:r>
+              <w:rPr>
+                <w:rFonts w:ascii="Arial" w:hAnsi="Arial" w:eastAsia="STHeiti" w:cs="Arial"/>
+                <w:b w:val="0"/>
+                <w:color w:val="1F2937"/>
+                <w:sz w:val="17"/>
+              </w:rPr>
+              <w:t>批量操作页保存或导入的优惠数据需先全部预读并生成子单列表，初始状态为待执行；执行时逐条处理，子单状态按执行中→已完成流转。每当一条子单由执行中转为已完成，主单总执行进度加 1。</w:t>
             </w:r>
           </w:p>
         </w:tc>
@@ -8122,7 +8236,7 @@
                 <w:color w:val="1F2937"/>
                 <w:sz w:val="17"/>
               </w:rPr>
-              <w:t>准备、暂停、已完成等原型中展示作废按钮的记录可点击。点击后弹出二次确认；确认成功后调用作废接口，状态更新为作废并隐藏作废按钮。准备状态作废表示批次不再执行；暂停状态作废表示停止剩余未执行会员；已完成状态作废仅改变批次记录标记，不回滚已完成会员账变和已生成记录。运行中记录需先暂停后再作废。</w:t>
+              <w:t>主单状态为待执行、执行中、已暂停、已完成时均展示并支持点击作废。点击后弹出二次确认；确认成功后调用作废接口，主单状态更新为作废并停止后续未执行处理。主单作废时，未领取子单统一转为作废并从客户端展示/领取范围移除；已领取、过期、放弃子单不受影响。已完成主单作废仅改变主单记录标记，不回滚已完成会员账变和已生成记录。</w:t>
             </w:r>
           </w:p>
         </w:tc>
@@ -8179,7 +8293,7 @@
                 <w:color w:val="1F2937"/>
                 <w:sz w:val="17"/>
               </w:rPr>
-              <w:t>点击后导出当前批次相关数据。已完成、运行中、暂停、准备、作废记录导出该批次会员明细、执行结果、领取结果和配置快照；导入失败记录导出失败数据及失败原因；导入中记录若暂无结果可导出当前已解析/已处理数据或提示“暂无可导出数据”。导出不改变批次状态。</w:t>
+              <w:t>仅主单状态为已完成或已作废时，点击“导出数据”才执行导出，导出内容包括会员明细、执行结果、领取结果和配置快照。其他状态即使展示“导出数据”按钮，点击也不产生实际效果，不发起导出请求，不改变主单或子单状态。</w:t>
             </w:r>
           </w:p>
         </w:tc>

</xml_diff>